<commit_message>
Updated alt tags and image display methods.
Updated Resume page and print view. Added icons to Resume.
</commit_message>
<xml_diff>
--- a/public/James_Frazier_Resume_ATS.docx
+++ b/public/James_Frazier_Resume_ATS.docx
@@ -91,73 +91,7 @@
             <w:szCs w:val="21"/>
             <w14:ligatures w14:val="none"/>
           </w:rPr>
-          <w:t>h</w:t>
-        </w:r>
-        <w:r>
-          <w:rPr>
-            <w:rStyle w:val="Hyperlink"/>
-            <w:rFonts w:ascii="Roboto" w:eastAsia="Times New Roman" w:hAnsi="Roboto" w:cs="Arial"/>
-            <w:kern w:val="0"/>
-            <w:sz w:val="21"/>
-            <w:szCs w:val="21"/>
-            <w14:ligatures w14:val="none"/>
-          </w:rPr>
-          <w:t>e</w:t>
-        </w:r>
-        <w:r>
-          <w:rPr>
-            <w:rStyle w:val="Hyperlink"/>
-            <w:rFonts w:ascii="Roboto" w:eastAsia="Times New Roman" w:hAnsi="Roboto" w:cs="Arial"/>
-            <w:kern w:val="0"/>
-            <w:sz w:val="21"/>
-            <w:szCs w:val="21"/>
-            <w14:ligatures w14:val="none"/>
-          </w:rPr>
-          <w:t>llo</w:t>
-        </w:r>
-        <w:r>
-          <w:rPr>
-            <w:rStyle w:val="Hyperlink"/>
-            <w:rFonts w:ascii="Roboto" w:eastAsia="Times New Roman" w:hAnsi="Roboto" w:cs="Arial"/>
-            <w:kern w:val="0"/>
-            <w:sz w:val="21"/>
-            <w:szCs w:val="21"/>
-            <w14:ligatures w14:val="none"/>
-          </w:rPr>
-          <w:t>@</w:t>
-        </w:r>
-        <w:r>
-          <w:rPr>
-            <w:rStyle w:val="Hyperlink"/>
-            <w:rFonts w:ascii="Roboto" w:eastAsia="Times New Roman" w:hAnsi="Roboto" w:cs="Arial"/>
-            <w:kern w:val="0"/>
-            <w:sz w:val="21"/>
-            <w:szCs w:val="21"/>
-            <w14:ligatures w14:val="none"/>
-          </w:rPr>
-          <w:t>webdevjames</w:t>
-        </w:r>
-        <w:r>
-          <w:rPr>
-            <w:rStyle w:val="Hyperlink"/>
-            <w:rFonts w:ascii="Roboto" w:eastAsia="Times New Roman" w:hAnsi="Roboto" w:cs="Arial"/>
-            <w:kern w:val="0"/>
-            <w:sz w:val="21"/>
-            <w:szCs w:val="21"/>
-            <w14:ligatures w14:val="none"/>
-          </w:rPr>
-          <w:t>.</w:t>
-        </w:r>
-        <w:r>
-          <w:rPr>
-            <w:rStyle w:val="Hyperlink"/>
-            <w:rFonts w:ascii="Roboto" w:eastAsia="Times New Roman" w:hAnsi="Roboto" w:cs="Arial"/>
-            <w:kern w:val="0"/>
-            <w:sz w:val="21"/>
-            <w:szCs w:val="21"/>
-            <w14:ligatures w14:val="none"/>
-          </w:rPr>
-          <w:t>com</w:t>
+          <w:t>hello@webdevjames.com</w:t>
         </w:r>
       </w:hyperlink>
     </w:p>
@@ -293,7 +227,7 @@
           <w:sz w:val="10"/>
           <w:szCs w:val="10"/>
         </w:rPr>
-        <w:pict w14:anchorId="3896DA4E">
+        <w:pict w14:anchorId="31B56BBC">
           <v:rect id="_x0000_i1028" alt="" style="width:468pt;height:.05pt;mso-width-percent:0;mso-height-percent:0;mso-width-percent:0;mso-height-percent:0" o:hralign="center" o:hrstd="t" o:hr="t" fillcolor="#a0a0a0" stroked="f"/>
         </w:pict>
       </w:r>
@@ -406,7 +340,7 @@
           <w:sz w:val="10"/>
           <w:szCs w:val="10"/>
         </w:rPr>
-        <w:pict w14:anchorId="09DE9E22">
+        <w:pict w14:anchorId="5C316A39">
           <v:rect id="_x0000_i1027" alt="" style="width:468pt;height:.05pt;mso-width-percent:0;mso-height-percent:0;mso-width-percent:0;mso-height-percent:0" o:hralign="center" o:hrstd="t" o:hr="t" fillcolor="#a0a0a0" stroked="f"/>
         </w:pict>
       </w:r>
@@ -699,7 +633,7 @@
           <w:sz w:val="10"/>
           <w:szCs w:val="10"/>
         </w:rPr>
-        <w:pict w14:anchorId="59B0C6C8">
+        <w:pict w14:anchorId="2B186324">
           <v:rect id="_x0000_i1026" alt="" style="width:468pt;height:.05pt;mso-width-percent:0;mso-height-percent:0;mso-width-percent:0;mso-height-percent:0" o:hralign="center" o:hrstd="t" o:hr="t" fillcolor="#a0a0a0" stroked="f"/>
         </w:pict>
       </w:r>
@@ -1692,7 +1626,7 @@
           <w:sz w:val="10"/>
           <w:szCs w:val="10"/>
         </w:rPr>
-        <w:pict w14:anchorId="06D18C3E">
+        <w:pict w14:anchorId="7F9BF6C7">
           <v:rect id="_x0000_i1025" alt="" style="width:468pt;height:.05pt;mso-width-percent:0;mso-height-percent:0;mso-width-percent:0;mso-height-percent:0" o:hralign="center" o:hrstd="t" o:hr="t" fillcolor="#a0a0a0" stroked="f"/>
         </w:pict>
       </w:r>
@@ -1770,6 +1704,24 @@
           <w14:ligatures w14:val="none"/>
         </w:rPr>
         <w:t xml:space="preserve"> </w:t>
+      </w:r>
+      <w:r>
+        <w:rPr>
+          <w:rFonts w:ascii="Roboto" w:eastAsia="Times New Roman" w:hAnsi="Roboto" w:cs="Arial"/>
+          <w:kern w:val="0"/>
+          <w14:ligatures w14:val="none"/>
+        </w:rPr>
+        <w:t xml:space="preserve">| </w:t>
+      </w:r>
+      <w:r>
+        <w:rPr>
+          <w:rFonts w:ascii="Roboto" w:eastAsia="Times New Roman" w:hAnsi="Roboto" w:cs="Arial"/>
+          <w:i/>
+          <w:iCs/>
+          <w:kern w:val="0"/>
+          <w14:ligatures w14:val="none"/>
+        </w:rPr>
+        <w:t>Jul 2006 – Jun 2009</w:t>
       </w:r>
     </w:p>
     <w:p>
@@ -1797,13 +1749,33 @@
           <w:szCs w:val="21"/>
           <w14:ligatures w14:val="none"/>
         </w:rPr>
-        <w:t>Bachelor of Arts in Visual Art</w:t>
-      </w:r>
-      <w:r>
-        <w:rPr>
-          <w:rFonts w:ascii="Roboto" w:eastAsia="Times New Roman" w:hAnsi="Roboto" w:cs="Arial"/>
-          <w:b/>
-          <w:bCs/>
+        <w:t>Bachelor of Arts</w:t>
+      </w:r>
+      <w:r>
+        <w:rPr>
+          <w:rFonts w:ascii="Roboto" w:eastAsia="Times New Roman" w:hAnsi="Roboto" w:cs="Arial"/>
+          <w:b/>
+          <w:bCs/>
+          <w:kern w:val="0"/>
+          <w:sz w:val="21"/>
+          <w:szCs w:val="21"/>
+          <w14:ligatures w14:val="none"/>
+        </w:rPr>
+        <w:t xml:space="preserve">: </w:t>
+      </w:r>
+      <w:r>
+        <w:rPr>
+          <w:rFonts w:ascii="Roboto" w:eastAsia="Times New Roman" w:hAnsi="Roboto" w:cs="Arial"/>
+          <w:kern w:val="0"/>
+          <w:sz w:val="21"/>
+          <w:szCs w:val="21"/>
+          <w14:ligatures w14:val="none"/>
+        </w:rPr>
+        <w:t>Visual Art</w:t>
+      </w:r>
+      <w:r>
+        <w:rPr>
+          <w:rFonts w:ascii="Roboto" w:eastAsia="Times New Roman" w:hAnsi="Roboto" w:cs="Arial"/>
           <w:kern w:val="0"/>
           <w:sz w:val="21"/>
           <w:szCs w:val="21"/>
@@ -1830,24 +1802,60 @@
       <w:r>
         <w:rPr>
           <w:rFonts w:ascii="Roboto" w:eastAsia="Times New Roman" w:hAnsi="Roboto" w:cs="Arial"/>
-          <w:i/>
-          <w:iCs/>
-          <w:kern w:val="0"/>
-          <w:sz w:val="21"/>
-          <w:szCs w:val="21"/>
-          <w14:ligatures w14:val="none"/>
-        </w:rPr>
-        <w:t>Honors:</w:t>
-      </w:r>
-      <w:r>
-        <w:rPr>
-          <w:rFonts w:ascii="Roboto" w:eastAsia="Times New Roman" w:hAnsi="Roboto" w:cs="Arial"/>
-          <w:kern w:val="0"/>
-          <w:sz w:val="21"/>
-          <w:szCs w:val="21"/>
-          <w14:ligatures w14:val="none"/>
-        </w:rPr>
-        <w:t xml:space="preserve"> Graduated with Honors, Valedictorian, Dean’s List</w:t>
+          <w:b/>
+          <w:bCs/>
+          <w:kern w:val="0"/>
+          <w:sz w:val="21"/>
+          <w:szCs w:val="21"/>
+          <w14:ligatures w14:val="none"/>
+        </w:rPr>
+        <w:t>Gradua</w:t>
+      </w:r>
+      <w:r>
+        <w:rPr>
+          <w:rFonts w:ascii="Roboto" w:eastAsia="Times New Roman" w:hAnsi="Roboto" w:cs="Arial"/>
+          <w:b/>
+          <w:bCs/>
+          <w:kern w:val="0"/>
+          <w:sz w:val="21"/>
+          <w:szCs w:val="21"/>
+          <w14:ligatures w14:val="none"/>
+        </w:rPr>
+        <w:t>te</w:t>
+      </w:r>
+      <w:r>
+        <w:rPr>
+          <w:rFonts w:ascii="Roboto" w:eastAsia="Times New Roman" w:hAnsi="Roboto" w:cs="Arial"/>
+          <w:b/>
+          <w:bCs/>
+          <w:kern w:val="0"/>
+          <w:sz w:val="21"/>
+          <w:szCs w:val="21"/>
+          <w14:ligatures w14:val="none"/>
+        </w:rPr>
+        <w:t xml:space="preserve"> Honors</w:t>
+      </w:r>
+      <w:r>
+        <w:rPr>
+          <w:rFonts w:ascii="Roboto" w:eastAsia="Times New Roman" w:hAnsi="Roboto" w:cs="Arial"/>
+          <w:b/>
+          <w:bCs/>
+          <w:kern w:val="0"/>
+          <w:sz w:val="21"/>
+          <w:szCs w:val="21"/>
+          <w14:ligatures w14:val="none"/>
+        </w:rPr>
+        <w:t>:</w:t>
+      </w:r>
+      <w:r>
+        <w:rPr>
+          <w:rFonts w:ascii="Roboto" w:eastAsia="Times New Roman" w:hAnsi="Roboto" w:cs="Arial"/>
+          <w:kern w:val="0"/>
+          <w:sz w:val="21"/>
+          <w:szCs w:val="21"/>
+          <w14:ligatures w14:val="none"/>
+        </w:rPr>
+        <w:t xml:space="preserve"> Valedictorian, Dean’s List</w:t>
       </w:r>
       <w:r>
         <w:rPr>

</xml_diff>